<commit_message>
Refresh packaged real-data inputs to v2
</commit_message>
<xml_diff>
--- a/inst/extdata/dataset_documentation.docx
+++ b/inst/extdata/dataset_documentation.docx
@@ -7673,7 +7673,7 @@
           <w:sz w:val="22"/>
           <w:szCs w:val="22"/>
         </w:rPr>
-        <w:t xml:space="preserve">V and E codes were used to capture care context. V45.x indicates a prior procedure or implanted device; V10.x/V12.x indicates personal history of a disease; E8xx/E9xx indicates an external cause (accident, adverse drug effect); V09.x indicates a drug-resistant organism; V15.x indicates allergies or other personal history. Admissions with no V/E codes receive {none}.</w:t>
+        <w:t xml:space="preserve">V and E codes were used to capture care context. V45.x indicates a prior procedure or implanted device; V10.x/V12.x indicates personal history of a disease; E8xx/E9xx indicates an external cause (accident, adverse drug effect); V09.x indicates a drug-resistant organism; V15.x indicates allergies or other personal history and is coded as Allergy_personal_hx (a distinct fifth label, separate from Personal_history_disease). Admissions with no V/E codes receive {none}.</w:t>
       </w:r>
     </w:p>
     <w:p>
@@ -8006,7 +8006,7 @@
                 <w:sz w:val="18"/>
                 <w:szCs w:val="18"/>
               </w:rPr>
-              <w:t xml:space="preserve">0–6</w:t>
+              <w:t xml:space="preserve">0–8</w:t>
             </w:r>
           </w:p>
         </w:tc>
@@ -8163,7 +8163,7 @@
                 <w:sz w:val="18"/>
                 <w:szCs w:val="18"/>
               </w:rPr>
-              <w:t xml:space="preserve">1–5</w:t>
+              <w:t xml:space="preserve">1–11</w:t>
             </w:r>
           </w:p>
         </w:tc>
@@ -8320,7 +8320,7 @@
                 <w:sz w:val="18"/>
                 <w:szCs w:val="18"/>
               </w:rPr>
-              <w:t xml:space="preserve">0–5</w:t>
+              <w:t xml:space="preserve">0–6</w:t>
             </w:r>
           </w:p>
         </w:tc>
@@ -8477,7 +8477,7 @@
                 <w:sz w:val="18"/>
                 <w:szCs w:val="18"/>
               </w:rPr>
-              <w:t xml:space="preserve">0–4</w:t>
+              <w:t xml:space="preserve">0–5</w:t>
             </w:r>
           </w:p>
         </w:tc>

</xml_diff>